<commit_message>
polish(P9): reduce AI-tone vocabulary per pre-submission-reviewer (unprecedented x4 -> 0; soften reveal/transformative)
</commit_message>
<xml_diff>
--- a/p9_india/submission/mir_package/01_manuscript_blinded.docx
+++ b/p9_india/submission/mir_package/01_manuscript_blinded.docx
@@ -362,7 +362,7 @@
         </w:numPr>
       </w:pPr>
       <w:r>
-        <w:t xml:space="preserve">The collapse coincides with India's decade of unprecedented institutional change: demonetisation, GST, IBC, UPI, PLI, COVID-19, and Atmanirbhar Bharat.</w:t>
+        <w:t xml:space="preserve">The collapse coincides with India's decade of intense institutional change: demonetisation, GST, IBC, UPI, PLI, COVID-19, and Atmanirbhar Bharat.</w:t>
       </w:r>
     </w:p>
     <w:p>
@@ -444,7 +444,7 @@
         <w:pStyle w:val="BodyText"/>
       </w:pPr>
       <w:r>
-        <w:t xml:space="preserve">This study makes three contributions. Firstly, the analysis provides the first within-country longitudinal evidence that the inverted-U export-intensity-productivity relationship can be dissolved by extreme institutional change, rather than only relocating its turning point. The turning point in 2014 lies at 61.8 per cent FSTS with the inverted-U strongly supported on Lind and Mehlum (2010) tests. In 2022 the turning point migrates inward to 40.7 per cent. In 2025 the quadratic curvature is statistically indistinguishable from zero, and the relationship is monotonically negative across the empirically relevant export-intensity range. Paternoster cross-wave z-tests (Paternoster et al., 1998) decisively reject coefficient equality. This identifies an environmental scope condition that the canonical I-P literature has implicitly assumed but never tested with multi-wave firm-level data. The inverted-U is conditional on institutional stability. Secondly, the analysis refines the developmental-state literature on public digital infrastructure by showing that public and private digital infrastructure are complements rather than substitutes in the export production function. India's UPI rails are transformative for domestic transactions. They do not substitute for the cross-border financial infrastructure that exporters specifically require. The negative Tier-2 moderation is most coherently interpreted as a purpose-alignment requirement that prior treatments of public infrastructure substitution have not articulated. Thirdly, this study documents that capability constructs theoretically stable across contexts can exhibit context-dependent operating signs when major policy incentives redirect their strategic use. The Technological Capability Index operates as a positive level-shifter of productivity in 2014 and 2022. It then flips negative in 2025 with a positive export-intensity interaction. This pattern is consistent with the strategic emphasis trade-off documented by Mizik and Jacobson (2003), which has not previously been brought into the international business literature.</w:t>
+        <w:t xml:space="preserve">This study makes three contributions. Firstly, the analysis provides the first within-country longitudinal evidence that the inverted-U export-intensity-productivity relationship can be dissolved by extreme institutional change, rather than only relocating its turning point. The turning point in 2014 lies at 61.8 per cent FSTS with the inverted-U strongly supported on Lind and Mehlum (2010) tests. In 2022 the turning point migrates inward to 40.7 per cent. In 2025 the quadratic curvature is statistically indistinguishable from zero, and the relationship is monotonically negative across the empirically relevant export-intensity range. Paternoster cross-wave z-tests (Paternoster et al., 1998) decisively reject coefficient equality. This identifies an environmental scope condition that the canonical I-P literature has implicitly assumed but never tested with multi-wave firm-level data. The inverted-U is conditional on institutional stability. Secondly, the analysis refines the developmental-state literature on public digital infrastructure by showing that public and private digital infrastructure are complements rather than substitutes in the export production function. India's UPI rails are highly effective for domestic transactions. They do not substitute for the cross-border financial infrastructure that exporters specifically require. The negative Tier-2 moderation is most coherently interpreted as a purpose-alignment requirement that prior treatments of public infrastructure substitution have not articulated. Thirdly, this study documents that capability constructs theoretically stable across contexts can exhibit context-dependent operating signs when major policy incentives redirect their strategic use. The Technological Capability Index operates as a positive level-shifter of productivity in 2014 and 2022. It then flips negative in 2025 with a positive export-intensity interaction. This pattern is consistent with the strategic emphasis trade-off documented by Mizik and Jacobson (2003), which has not previously been brought into the international business literature.</w:t>
       </w:r>
     </w:p>
     <w:p>
@@ -539,7 +539,7 @@
         <w:pStyle w:val="BodyText"/>
       </w:pPr>
       <w:r>
-        <w:t xml:space="preserve">North (1990) and Williamson (2000) distinguish institutional change at multiple levels operating at different time scales: formal rules (years), regulatory enforcement (decades), and informal norms (generations). India's 2014 to 2025 window contains formal-rule shocks at unprecedented density. These include demonetisation (November 2016), the Goods and Services Tax (July 2017), the Insolvency and Bankruptcy Code (May 2016), the Production-Linked Incentive scheme (2020), COVID-19 supply-chain disruption (2020 to 2022), and the Atmanirbhar Bharat self-reliance policy (2020). Each is non-trivial individually. The compounding effect over a decade has no comparable historical precedent in a major emerging market.</w:t>
+        <w:t xml:space="preserve">North (1990) and Williamson (2000) distinguish institutional change at multiple levels operating at different time scales: formal rules (years), regulatory enforcement (decades), and informal norms (generations). India's 2014 to 2025 window contains formal-rule shocks at exceptional density. These include demonetisation (November 2016), the Goods and Services Tax (July 2017), the Insolvency and Bankruptcy Code (May 2016), the Production-Linked Incentive scheme (2020), COVID-19 supply-chain disruption (2020 to 2022), and the Atmanirbhar Bharat self-reliance policy (2020). Each is non-trivial individually. The compounding effect over a decade has no comparable historical precedent in a major emerging market.</w:t>
       </w:r>
     </w:p>
     <w:p>
@@ -671,7 +671,7 @@
         <w:pStyle w:val="FirstParagraph"/>
       </w:pPr>
       <w:r>
-        <w:t xml:space="preserve">The Digital Adoption Index (DAI) is decomposed into two tiers that reflect distinct types of digital infrastructure. Tier-1 captures private firm-level digital adoption, measured by an own-website binary available in all three WBES waves (2014, 2022, 2025). Tier-2 captures public-infrastructure-mediated digital adoption, measured by the percentage of sales received via electronic payment, available only in the 2025 BREADY schema. India's Unified Payments Interface (UPI) launched in April 2016 and reached 12 billion transactions per month by 2024, providing the empirical context for Tier-2. UPI is public digital infrastructure on a scale unprecedented in any emerging economy.</w:t>
+        <w:t xml:space="preserve">The Digital Adoption Index (DAI) is decomposed into two tiers that reflect distinct types of digital infrastructure. Tier-1 captures private firm-level digital adoption, measured by an own-website binary available in all three WBES waves (2014, 2022, 2025). Tier-2 captures public-infrastructure-mediated digital adoption, measured by the percentage of sales received via electronic payment, available only in the 2025 BREADY schema. India's Unified Payments Interface (UPI) launched in April 2016 and reached 12 billion transactions per month by 2024, providing the empirical context for Tier-2. UPI is public digital infrastructure on a scale exceptional in any emerging economy.</w:t>
       </w:r>
     </w:p>
     <w:p>
@@ -5048,7 +5048,7 @@
         <w:t xml:space="preserve"> </w:t>
       </w:r>
       <w:r>
-        <w:t xml:space="preserve">Of the five specifications applied to the headline cross-wave shift finding, four (R1, R2, R3b, R4) confirm the qualitative pattern of inverted-U presence in 2014 and 2022 with disappearance in 2025. The fifth (R3a) confirms presence in 2022 and disappearance in 2025. R3a also reveals that the 2014 inverted-U is concentrated in larger firms rather than universal across firm sizes. The cross-wave Paternoster z-tests are robust to manufacturing-only sub-sampling. Full robustness output is reported in Table 5.</w:t>
+        <w:t xml:space="preserve">Of the five specifications applied to the headline cross-wave shift finding, four (R1, R2, R3b, R4) confirm the qualitative pattern of inverted-U presence in 2014 and 2022 with disappearance in 2025. The fifth (R3a) confirms presence in 2022 and disappearance in 2025. R3a also shows that the 2014 inverted-U is concentrated in larger firms rather than universal across firm sizes. The cross-wave Paternoster z-tests are robust to manufacturing-only sub-sampling. Full robustness output is reported in Table 5.</w:t>
       </w:r>
     </w:p>
     <w:p>
@@ -7034,7 +7034,7 @@
         <w:pStyle w:val="BodyText"/>
       </w:pPr>
       <w:r>
-        <w:t xml:space="preserve">The five robustness specifications reported in §4.6 reinforce the structural interpretation. The manufacturing-only sub-sample confirms the cross-wave shift with Paternoster z-tests within 12 per cent of full-sample magnitudes. This rules out service-firm composition as a driver. The trimmed-FSTS specification rules out extreme exporter influence. The size sub-sample analysis reveals a finer nuance. The 2014 inverted-U was concentrated in larger firms (employees ≥ 100). The pattern extended to smaller firms only by 2022 before collapsing for both segments in 2025. This pattern is consistent with the documented broadening of SME exporter participation under the 2014 to 2020 export-promotion policy expansion, followed by its post-2020 reversal under Atmanirbhar Bharat. The pattern is not consistent with a measurement-induced collapse.</w:t>
+        <w:t xml:space="preserve">The five robustness specifications reported in §4.6 reinforce the structural interpretation. The manufacturing-only sub-sample confirms the cross-wave shift with Paternoster z-tests within 12 per cent of full-sample magnitudes. This rules out service-firm composition as a driver. The trimmed-FSTS specification rules out extreme exporter influence. The size sub-sample analysis shows a finer nuance. The 2014 inverted-U was concentrated in larger firms (employees ≥ 100). The pattern extended to smaller firms only by 2022 before collapsing for both segments in 2025. This pattern is consistent with the documented broadening of SME exporter participation under the 2014 to 2020 export-promotion policy expansion, followed by its post-2020 reversal under Atmanirbhar Bharat. The pattern is not consistent with a measurement-induced collapse.</w:t>
       </w:r>
     </w:p>
     <w:bookmarkEnd w:id="54"/>
@@ -7086,7 +7086,7 @@
         <w:pStyle w:val="FirstParagraph"/>
       </w:pPr>
       <w:r>
-        <w:t xml:space="preserve">The Technological Capability Index operates as a positive level-shifter in 2014 (β = +0.12, p &lt; 0.0001) and 2022 (β = +0.19, p &lt; 0.0001), supporting H3a. In 2025, the TCI main effect flips to negative (β = −0.08, p &lt; 0.0001) and the FSTS × TCI interaction becomes positive and significant (β = +0.20, p = 0.03), supporting H3b. The pattern is consistent with the Mizik and Jacobson (2003) strategic emphasis trade-off. When policy incentives redirect technological capability investment toward domestic manufacturing (PLI), firms accumulating TCI primarily for domestic ends experience competing demands on the same internal resources. This suppresses the productivity returns that TCI delivered when capability accumulation was indifferent to export orientation. The positive FSTS × TCI interaction in 2025 indicates that TCI continues to deliver returns specifically to firms that maintain high export orientation. This is the subset for whom capability investment remains export-aligned. The result reinforces the broader institutional argument that under unprecedented strategic redirection, even firm-level capability constructs behave differently.</w:t>
+        <w:t xml:space="preserve">The Technological Capability Index operates as a positive level-shifter in 2014 (β = +0.12, p &lt; 0.0001) and 2022 (β = +0.19, p &lt; 0.0001), supporting H3a. In 2025, the TCI main effect flips to negative (β = −0.08, p &lt; 0.0001) and the FSTS × TCI interaction becomes positive and significant (β = +0.20, p = 0.03), supporting H3b. The pattern is consistent with the Mizik and Jacobson (2003) strategic emphasis trade-off. When policy incentives redirect technological capability investment toward domestic manufacturing (PLI), firms accumulating TCI primarily for domestic ends experience competing demands on the same internal resources. This suppresses the productivity returns that TCI delivered when capability accumulation was indifferent to export orientation. The positive FSTS × TCI interaction in 2025 indicates that TCI continues to deliver returns specifically to firms that maintain high export orientation. This is the subset for whom capability investment remains export-aligned. The result reinforces the broader institutional argument that under sweeping strategic redirection, even firm-level capability constructs behave differently.</w:t>
       </w:r>
     </w:p>
     <w:bookmarkEnd w:id="56"/>

</xml_diff>